<commit_message>
bai 3 4 5
</commit_message>
<xml_diff>
--- a/Vũ Thiên Trường.docx
+++ b/Vũ Thiên Trường.docx
@@ -1,31 +1,10 @@
 
 <file path=word/document.xml><?xml version="1.0" encoding="utf-8"?>
-<w:document xmlns:wpc="http://schemas.microsoft.com/office/word/2010/wordprocessingCanvas" xmlns:cx="http://schemas.microsoft.com/office/drawing/2014/chartex" xmlns:cx1="http://schemas.microsoft.com/office/drawing/2015/9/8/chartex" xmlns:cx2="http://schemas.microsoft.com/office/drawing/2015/10/21/chartex" xmlns:cx3="http://schemas.microsoft.com/office/drawing/2016/5/9/chartex" xmlns:cx4="http://schemas.microsoft.com/office/drawing/2016/5/10/chartex" xmlns:cx5="http://schemas.microsoft.com/office/drawing/2016/5/11/chartex" xmlns:cx6="http://schemas.microsoft.com/office/drawing/2016/5/12/chartex" xmlns:cx7="http://schemas.microsoft.com/office/drawing/2016/5/13/chartex" xmlns:cx8="http://schemas.microsoft.com/office/drawing/2016/5/14/chartex" xmlns:mc="http://schemas.openxmlformats.org/markup-compatibility/2006" xmlns:aink="http://schemas.microsoft.com/office/drawing/2016/ink" xmlns:am3d="http://schemas.microsoft.com/office/drawing/2017/model3d" xmlns:o="urn:schemas-microsoft-com:office:office" xmlns:r="http://schemas.openxmlformats.org/officeDocument/2006/relationships" xmlns:m="http://schemas.openxmlformats.org/officeDocument/2006/math" xmlns:v="urn:schemas-microsoft-com:vml" xmlns:wp14="http://schemas.microsoft.com/office/word/2010/wordprocessingDrawing" xmlns:wp="http://schemas.openxmlformats.org/drawingml/2006/wordprocessingDrawing" xmlns:w10="urn:schemas-microsoft-com:office:word" xmlns:w="http://schemas.openxmlformats.org/wordprocessingml/2006/main" xmlns:w14="http://schemas.microsoft.com/office/word/2010/wordml" xmlns:w15="http://schemas.microsoft.com/office/word/2012/wordml" xmlns:w16cex="http://schemas.microsoft.com/office/word/2018/wordml/cex" xmlns:w16cid="http://schemas.microsoft.com/office/word/2016/wordml/cid" xmlns:w16="http://schemas.microsoft.com/office/word/2018/wordml" xmlns:w16sdtdh="http://schemas.microsoft.com/office/word/2020/wordml/sdtdatahash" xmlns:w16se="http://schemas.microsoft.com/office/word/2015/wordml/symex" xmlns:wpg="http://schemas.microsoft.com/office/word/2010/wordprocessingGroup" xmlns:wpi="http://schemas.microsoft.com/office/word/2010/wordprocessingInk" xmlns:wne="http://schemas.microsoft.com/office/word/2006/wordml" xmlns:wps="http://schemas.microsoft.com/office/word/2010/wordprocessingShape" mc:Ignorable="w14 w15 w16se w16cid w16 w16cex w16sdtdh wp14">
+<w:document xmlns:wpc="http://schemas.microsoft.com/office/word/2010/wordprocessingCanvas" xmlns:cx="http://schemas.microsoft.com/office/drawing/2014/chartex" xmlns:cx1="http://schemas.microsoft.com/office/drawing/2015/9/8/chartex" xmlns:cx2="http://schemas.microsoft.com/office/drawing/2015/10/21/chartex" xmlns:cx3="http://schemas.microsoft.com/office/drawing/2016/5/9/chartex" xmlns:cx4="http://schemas.microsoft.com/office/drawing/2016/5/10/chartex" xmlns:cx5="http://schemas.microsoft.com/office/drawing/2016/5/11/chartex" xmlns:cx6="http://schemas.microsoft.com/office/drawing/2016/5/12/chartex" xmlns:cx7="http://schemas.microsoft.com/office/drawing/2016/5/13/chartex" xmlns:cx8="http://schemas.microsoft.com/office/drawing/2016/5/14/chartex" xmlns:mc="http://schemas.openxmlformats.org/markup-compatibility/2006" xmlns:aink="http://schemas.microsoft.com/office/drawing/2016/ink" xmlns:am3d="http://schemas.microsoft.com/office/drawing/2017/model3d" xmlns:o="urn:schemas-microsoft-com:office:office" xmlns:r="http://schemas.openxmlformats.org/officeDocument/2006/relationships" xmlns:m="http://schemas.openxmlformats.org/officeDocument/2006/math" xmlns:v="urn:schemas-microsoft-com:vml" xmlns:wp14="http://schemas.microsoft.com/office/word/2010/wordprocessingDrawing" xmlns:wp="http://schemas.openxmlformats.org/drawingml/2006/wordprocessingDrawing" xmlns:w10="urn:schemas-microsoft-com:office:word" xmlns:w="http://schemas.openxmlformats.org/wordprocessingml/2006/main" xmlns:w14="http://schemas.microsoft.com/office/word/2010/wordml" xmlns:w15="http://schemas.microsoft.com/office/word/2012/wordml" xmlns:w16cid="http://schemas.microsoft.com/office/word/2016/wordml/cid" xmlns:w16se="http://schemas.microsoft.com/office/word/2015/wordml/symex" xmlns:wpg="http://schemas.microsoft.com/office/word/2010/wordprocessingGroup" xmlns:wpi="http://schemas.microsoft.com/office/word/2010/wordprocessingInk" xmlns:wne="http://schemas.microsoft.com/office/word/2006/wordml" xmlns:wps="http://schemas.microsoft.com/office/word/2010/wordprocessingShape" mc:Ignorable="w14 w15 w16se w16cid wp14">
   <w:body>
     <w:p>
-      <w:proofErr w:type="spellStart"/>
-      <w:r>
-        <w:t>Vũ</w:t>
-      </w:r>
-      <w:proofErr w:type="spellEnd"/>
-      <w:r>
-        <w:t xml:space="preserve"> </w:t>
-      </w:r>
-      <w:proofErr w:type="spellStart"/>
-      <w:r>
-        <w:t>Thiên</w:t>
-      </w:r>
-      <w:proofErr w:type="spellEnd"/>
-      <w:r>
-        <w:t xml:space="preserve"> </w:t>
-      </w:r>
-      <w:proofErr w:type="spellStart"/>
-      <w:r>
-        <w:t>Trường</w:t>
-      </w:r>
-      <w:proofErr w:type="spellEnd"/>
-      <w:r>
-        <w:t xml:space="preserve"> </w:t>
+      <w:r>
+        <w:t xml:space="preserve">Vũ Thiên Trường </w:t>
       </w:r>
     </w:p>
     <w:p>
@@ -39,6 +18,12 @@
         <w:t>Github</w:t>
       </w:r>
       <w:proofErr w:type="spellEnd"/>
+      <w:r>
+        <w:t xml:space="preserve"> </w:t>
+      </w:r>
+      <w:r>
+        <w:t>https://github.com/ThenScu/Tuan6.git</w:t>
+      </w:r>
     </w:p>
     <w:p/>
     <w:p>
@@ -53,6 +38,9 @@
     </w:p>
     <w:p>
       <w:r>
+        <w:rPr>
+          <w:noProof/>
+        </w:rPr>
         <w:drawing>
           <wp:inline distT="0" distB="0" distL="0" distR="0" wp14:anchorId="1462B462" wp14:editId="29AECFEC">
             <wp:extent cx="2712955" cy="5921253"/>
@@ -90,6 +78,9 @@
         </w:drawing>
       </w:r>
       <w:r>
+        <w:rPr>
+          <w:noProof/>
+        </w:rPr>
         <w:drawing>
           <wp:inline distT="0" distB="0" distL="0" distR="0" wp14:anchorId="79B4C425" wp14:editId="26D5A98B">
             <wp:extent cx="2705334" cy="5799323"/>
@@ -129,6 +120,9 @@
     </w:p>
     <w:p>
       <w:r>
+        <w:rPr>
+          <w:noProof/>
+        </w:rPr>
         <w:lastRenderedPageBreak/>
         <w:drawing>
           <wp:inline distT="0" distB="0" distL="0" distR="0" wp14:anchorId="5132D541" wp14:editId="33C5BE04">
@@ -167,6 +161,9 @@
         </w:drawing>
       </w:r>
       <w:r>
+        <w:rPr>
+          <w:noProof/>
+        </w:rPr>
         <w:lastRenderedPageBreak/>
         <w:drawing>
           <wp:inline distT="0" distB="0" distL="0" distR="0" wp14:anchorId="11BE5CBC" wp14:editId="4EF84015">
@@ -209,6 +206,9 @@
     <w:p/>
     <w:p>
       <w:r>
+        <w:rPr>
+          <w:noProof/>
+        </w:rPr>
         <w:lastRenderedPageBreak/>
         <w:drawing>
           <wp:inline distT="0" distB="0" distL="0" distR="0" wp14:anchorId="188CEFA7" wp14:editId="75B17DCE">
@@ -249,6 +249,9 @@
     </w:p>
     <w:p>
       <w:r>
+        <w:rPr>
+          <w:noProof/>
+        </w:rPr>
         <w:lastRenderedPageBreak/>
         <w:drawing>
           <wp:inline distT="0" distB="0" distL="0" distR="0" wp14:anchorId="1023A568" wp14:editId="7022D9D7">
@@ -289,6 +292,9 @@
     </w:p>
     <w:p>
       <w:r>
+        <w:rPr>
+          <w:noProof/>
+        </w:rPr>
         <w:lastRenderedPageBreak/>
         <w:drawing>
           <wp:inline distT="0" distB="0" distL="0" distR="0" wp14:anchorId="1A166BDD" wp14:editId="21F4140D">
@@ -335,6 +341,9 @@
     </w:p>
     <w:p>
       <w:r>
+        <w:rPr>
+          <w:noProof/>
+        </w:rPr>
         <w:lastRenderedPageBreak/>
         <w:drawing>
           <wp:inline distT="0" distB="0" distL="0" distR="0" wp14:anchorId="45DAD64A" wp14:editId="775BA19B">
@@ -373,6 +382,9 @@
         </w:drawing>
       </w:r>
       <w:r>
+        <w:rPr>
+          <w:noProof/>
+        </w:rPr>
         <w:drawing>
           <wp:inline distT="0" distB="0" distL="0" distR="0" wp14:anchorId="5968CCA0" wp14:editId="247EEDA5">
             <wp:extent cx="2758679" cy="5959356"/>
@@ -412,6 +424,9 @@
     </w:p>
     <w:p>
       <w:r>
+        <w:rPr>
+          <w:noProof/>
+        </w:rPr>
         <w:lastRenderedPageBreak/>
         <w:drawing>
           <wp:inline distT="0" distB="0" distL="0" distR="0" wp14:anchorId="0252337F" wp14:editId="32DC5CC3">
@@ -452,6 +467,9 @@
     </w:p>
     <w:p>
       <w:r>
+        <w:rPr>
+          <w:noProof/>
+        </w:rPr>
         <w:lastRenderedPageBreak/>
         <w:drawing>
           <wp:inline distT="0" distB="0" distL="0" distR="0" wp14:anchorId="674DC05E" wp14:editId="2CD9B409">
@@ -492,6 +510,9 @@
     </w:p>
     <w:p>
       <w:r>
+        <w:rPr>
+          <w:noProof/>
+        </w:rPr>
         <w:lastRenderedPageBreak/>
         <w:drawing>
           <wp:inline distT="0" distB="0" distL="0" distR="0" wp14:anchorId="73934538" wp14:editId="220B98C4">
@@ -532,6 +553,9 @@
     </w:p>
     <w:p>
       <w:r>
+        <w:rPr>
+          <w:noProof/>
+        </w:rPr>
         <w:lastRenderedPageBreak/>
         <w:drawing>
           <wp:inline distT="0" distB="0" distL="0" distR="0" wp14:anchorId="0F2F24BB" wp14:editId="3B84CDEF">
@@ -572,6 +596,9 @@
     </w:p>
     <w:p>
       <w:r>
+        <w:rPr>
+          <w:noProof/>
+        </w:rPr>
         <w:lastRenderedPageBreak/>
         <w:drawing>
           <wp:inline distT="0" distB="0" distL="0" distR="0" wp14:anchorId="368757E0" wp14:editId="4C51740D">
@@ -598,6 +625,945 @@
                     <a:xfrm>
                       <a:off x="0" y="0"/>
                       <a:ext cx="5943600" cy="6238240"/>
+                    </a:xfrm>
+                    <a:prstGeom prst="rect">
+                      <a:avLst/>
+                    </a:prstGeom>
+                  </pic:spPr>
+                </pic:pic>
+              </a:graphicData>
+            </a:graphic>
+          </wp:inline>
+        </w:drawing>
+      </w:r>
+    </w:p>
+    <w:p/>
+    <w:p/>
+    <w:p/>
+    <w:p/>
+    <w:p/>
+    <w:p/>
+    <w:p>
+      <w:r>
+        <w:lastRenderedPageBreak/>
+        <w:t>Bai3</w:t>
+      </w:r>
+    </w:p>
+    <w:p>
+      <w:r>
+        <w:lastRenderedPageBreak/>
+        <w:drawing>
+          <wp:inline distT="0" distB="0" distL="0" distR="0" wp14:anchorId="273B59B1" wp14:editId="3C8D8DCC">
+            <wp:extent cx="2616950" cy="5714010"/>
+            <wp:effectExtent l="0" t="0" r="0" b="1270"/>
+            <wp:docPr id="17" name="Picture 17"/>
+            <wp:cNvGraphicFramePr>
+              <a:graphicFrameLocks xmlns:a="http://schemas.openxmlformats.org/drawingml/2006/main" noChangeAspect="1"/>
+            </wp:cNvGraphicFramePr>
+            <a:graphic xmlns:a="http://schemas.openxmlformats.org/drawingml/2006/main">
+              <a:graphicData uri="http://schemas.openxmlformats.org/drawingml/2006/picture">
+                <pic:pic xmlns:pic="http://schemas.openxmlformats.org/drawingml/2006/picture">
+                  <pic:nvPicPr>
+                    <pic:cNvPr id="1" name=""/>
+                    <pic:cNvPicPr/>
+                  </pic:nvPicPr>
+                  <pic:blipFill>
+                    <a:blip r:embed="rId18"/>
+                    <a:stretch>
+                      <a:fillRect/>
+                    </a:stretch>
+                  </pic:blipFill>
+                  <pic:spPr>
+                    <a:xfrm>
+                      <a:off x="0" y="0"/>
+                      <a:ext cx="2662731" cy="5813971"/>
+                    </a:xfrm>
+                    <a:prstGeom prst="rect">
+                      <a:avLst/>
+                    </a:prstGeom>
+                  </pic:spPr>
+                </pic:pic>
+              </a:graphicData>
+            </a:graphic>
+          </wp:inline>
+        </w:drawing>
+      </w:r>
+      <w:r>
+        <w:drawing>
+          <wp:inline distT="0" distB="0" distL="0" distR="0" wp14:anchorId="7FCA52F1" wp14:editId="2F56057C">
+            <wp:extent cx="2612571" cy="5930680"/>
+            <wp:effectExtent l="0" t="0" r="0" b="0"/>
+            <wp:docPr id="18" name="Picture 18"/>
+            <wp:cNvGraphicFramePr>
+              <a:graphicFrameLocks xmlns:a="http://schemas.openxmlformats.org/drawingml/2006/main" noChangeAspect="1"/>
+            </wp:cNvGraphicFramePr>
+            <a:graphic xmlns:a="http://schemas.openxmlformats.org/drawingml/2006/main">
+              <a:graphicData uri="http://schemas.openxmlformats.org/drawingml/2006/picture">
+                <pic:pic xmlns:pic="http://schemas.openxmlformats.org/drawingml/2006/picture">
+                  <pic:nvPicPr>
+                    <pic:cNvPr id="1" name=""/>
+                    <pic:cNvPicPr/>
+                  </pic:nvPicPr>
+                  <pic:blipFill>
+                    <a:blip r:embed="rId19"/>
+                    <a:stretch>
+                      <a:fillRect/>
+                    </a:stretch>
+                  </pic:blipFill>
+                  <pic:spPr>
+                    <a:xfrm>
+                      <a:off x="0" y="0"/>
+                      <a:ext cx="2732847" cy="6203713"/>
+                    </a:xfrm>
+                    <a:prstGeom prst="rect">
+                      <a:avLst/>
+                    </a:prstGeom>
+                  </pic:spPr>
+                </pic:pic>
+              </a:graphicData>
+            </a:graphic>
+          </wp:inline>
+        </w:drawing>
+      </w:r>
+      <w:r>
+        <w:lastRenderedPageBreak/>
+        <w:drawing>
+          <wp:inline distT="0" distB="0" distL="0" distR="0" wp14:anchorId="5E324CA9" wp14:editId="260C9534">
+            <wp:extent cx="5943600" cy="5544820"/>
+            <wp:effectExtent l="0" t="0" r="0" b="0"/>
+            <wp:docPr id="19" name="Picture 19"/>
+            <wp:cNvGraphicFramePr>
+              <a:graphicFrameLocks xmlns:a="http://schemas.openxmlformats.org/drawingml/2006/main" noChangeAspect="1"/>
+            </wp:cNvGraphicFramePr>
+            <a:graphic xmlns:a="http://schemas.openxmlformats.org/drawingml/2006/main">
+              <a:graphicData uri="http://schemas.openxmlformats.org/drawingml/2006/picture">
+                <pic:pic xmlns:pic="http://schemas.openxmlformats.org/drawingml/2006/picture">
+                  <pic:nvPicPr>
+                    <pic:cNvPr id="1" name=""/>
+                    <pic:cNvPicPr/>
+                  </pic:nvPicPr>
+                  <pic:blipFill>
+                    <a:blip r:embed="rId20"/>
+                    <a:stretch>
+                      <a:fillRect/>
+                    </a:stretch>
+                  </pic:blipFill>
+                  <pic:spPr>
+                    <a:xfrm>
+                      <a:off x="0" y="0"/>
+                      <a:ext cx="5943600" cy="5544820"/>
+                    </a:xfrm>
+                    <a:prstGeom prst="rect">
+                      <a:avLst/>
+                    </a:prstGeom>
+                  </pic:spPr>
+                </pic:pic>
+              </a:graphicData>
+            </a:graphic>
+          </wp:inline>
+        </w:drawing>
+      </w:r>
+      <w:r>
+        <w:lastRenderedPageBreak/>
+        <w:drawing>
+          <wp:inline distT="0" distB="0" distL="0" distR="0" wp14:anchorId="0FCCD5CC" wp14:editId="13FBFDA4">
+            <wp:extent cx="5943600" cy="5178425"/>
+            <wp:effectExtent l="0" t="0" r="0" b="3175"/>
+            <wp:docPr id="20" name="Picture 20"/>
+            <wp:cNvGraphicFramePr>
+              <a:graphicFrameLocks xmlns:a="http://schemas.openxmlformats.org/drawingml/2006/main" noChangeAspect="1"/>
+            </wp:cNvGraphicFramePr>
+            <a:graphic xmlns:a="http://schemas.openxmlformats.org/drawingml/2006/main">
+              <a:graphicData uri="http://schemas.openxmlformats.org/drawingml/2006/picture">
+                <pic:pic xmlns:pic="http://schemas.openxmlformats.org/drawingml/2006/picture">
+                  <pic:nvPicPr>
+                    <pic:cNvPr id="1" name=""/>
+                    <pic:cNvPicPr/>
+                  </pic:nvPicPr>
+                  <pic:blipFill>
+                    <a:blip r:embed="rId21"/>
+                    <a:stretch>
+                      <a:fillRect/>
+                    </a:stretch>
+                  </pic:blipFill>
+                  <pic:spPr>
+                    <a:xfrm>
+                      <a:off x="0" y="0"/>
+                      <a:ext cx="5943600" cy="5178425"/>
+                    </a:xfrm>
+                    <a:prstGeom prst="rect">
+                      <a:avLst/>
+                    </a:prstGeom>
+                  </pic:spPr>
+                </pic:pic>
+              </a:graphicData>
+            </a:graphic>
+          </wp:inline>
+        </w:drawing>
+      </w:r>
+      <w:r>
+        <w:lastRenderedPageBreak/>
+        <w:drawing>
+          <wp:inline distT="0" distB="0" distL="0" distR="0" wp14:anchorId="7598E653" wp14:editId="0608F12E">
+            <wp:extent cx="5943600" cy="3773170"/>
+            <wp:effectExtent l="0" t="0" r="0" b="0"/>
+            <wp:docPr id="21" name="Picture 21"/>
+            <wp:cNvGraphicFramePr>
+              <a:graphicFrameLocks xmlns:a="http://schemas.openxmlformats.org/drawingml/2006/main" noChangeAspect="1"/>
+            </wp:cNvGraphicFramePr>
+            <a:graphic xmlns:a="http://schemas.openxmlformats.org/drawingml/2006/main">
+              <a:graphicData uri="http://schemas.openxmlformats.org/drawingml/2006/picture">
+                <pic:pic xmlns:pic="http://schemas.openxmlformats.org/drawingml/2006/picture">
+                  <pic:nvPicPr>
+                    <pic:cNvPr id="1" name=""/>
+                    <pic:cNvPicPr/>
+                  </pic:nvPicPr>
+                  <pic:blipFill>
+                    <a:blip r:embed="rId22"/>
+                    <a:stretch>
+                      <a:fillRect/>
+                    </a:stretch>
+                  </pic:blipFill>
+                  <pic:spPr>
+                    <a:xfrm>
+                      <a:off x="0" y="0"/>
+                      <a:ext cx="5943600" cy="3773170"/>
+                    </a:xfrm>
+                    <a:prstGeom prst="rect">
+                      <a:avLst/>
+                    </a:prstGeom>
+                  </pic:spPr>
+                </pic:pic>
+              </a:graphicData>
+            </a:graphic>
+          </wp:inline>
+        </w:drawing>
+      </w:r>
+      <w:r>
+        <w:lastRenderedPageBreak/>
+        <w:drawing>
+          <wp:inline distT="0" distB="0" distL="0" distR="0" wp14:anchorId="25F0DD45" wp14:editId="6499F96D">
+            <wp:extent cx="5943600" cy="6136640"/>
+            <wp:effectExtent l="0" t="0" r="0" b="0"/>
+            <wp:docPr id="22" name="Picture 22"/>
+            <wp:cNvGraphicFramePr>
+              <a:graphicFrameLocks xmlns:a="http://schemas.openxmlformats.org/drawingml/2006/main" noChangeAspect="1"/>
+            </wp:cNvGraphicFramePr>
+            <a:graphic xmlns:a="http://schemas.openxmlformats.org/drawingml/2006/main">
+              <a:graphicData uri="http://schemas.openxmlformats.org/drawingml/2006/picture">
+                <pic:pic xmlns:pic="http://schemas.openxmlformats.org/drawingml/2006/picture">
+                  <pic:nvPicPr>
+                    <pic:cNvPr id="1" name=""/>
+                    <pic:cNvPicPr/>
+                  </pic:nvPicPr>
+                  <pic:blipFill>
+                    <a:blip r:embed="rId23"/>
+                    <a:stretch>
+                      <a:fillRect/>
+                    </a:stretch>
+                  </pic:blipFill>
+                  <pic:spPr>
+                    <a:xfrm>
+                      <a:off x="0" y="0"/>
+                      <a:ext cx="5943600" cy="6136640"/>
+                    </a:xfrm>
+                    <a:prstGeom prst="rect">
+                      <a:avLst/>
+                    </a:prstGeom>
+                  </pic:spPr>
+                </pic:pic>
+              </a:graphicData>
+            </a:graphic>
+          </wp:inline>
+        </w:drawing>
+      </w:r>
+      <w:r>
+        <w:lastRenderedPageBreak/>
+        <w:drawing>
+          <wp:inline distT="0" distB="0" distL="0" distR="0" wp14:anchorId="41C0036C" wp14:editId="01EF6149">
+            <wp:extent cx="5943600" cy="5956935"/>
+            <wp:effectExtent l="0" t="0" r="0" b="5715"/>
+            <wp:docPr id="23" name="Picture 23"/>
+            <wp:cNvGraphicFramePr>
+              <a:graphicFrameLocks xmlns:a="http://schemas.openxmlformats.org/drawingml/2006/main" noChangeAspect="1"/>
+            </wp:cNvGraphicFramePr>
+            <a:graphic xmlns:a="http://schemas.openxmlformats.org/drawingml/2006/main">
+              <a:graphicData uri="http://schemas.openxmlformats.org/drawingml/2006/picture">
+                <pic:pic xmlns:pic="http://schemas.openxmlformats.org/drawingml/2006/picture">
+                  <pic:nvPicPr>
+                    <pic:cNvPr id="1" name=""/>
+                    <pic:cNvPicPr/>
+                  </pic:nvPicPr>
+                  <pic:blipFill>
+                    <a:blip r:embed="rId24"/>
+                    <a:stretch>
+                      <a:fillRect/>
+                    </a:stretch>
+                  </pic:blipFill>
+                  <pic:spPr>
+                    <a:xfrm>
+                      <a:off x="0" y="0"/>
+                      <a:ext cx="5943600" cy="5956935"/>
+                    </a:xfrm>
+                    <a:prstGeom prst="rect">
+                      <a:avLst/>
+                    </a:prstGeom>
+                  </pic:spPr>
+                </pic:pic>
+              </a:graphicData>
+            </a:graphic>
+          </wp:inline>
+        </w:drawing>
+      </w:r>
+    </w:p>
+    <w:p>
+      <w:r>
+        <w:lastRenderedPageBreak/>
+        <w:drawing>
+          <wp:inline distT="0" distB="0" distL="0" distR="0" wp14:anchorId="03D669F6" wp14:editId="63A2AD42">
+            <wp:extent cx="5943600" cy="4013200"/>
+            <wp:effectExtent l="0" t="0" r="0" b="6350"/>
+            <wp:docPr id="24" name="Picture 24"/>
+            <wp:cNvGraphicFramePr>
+              <a:graphicFrameLocks xmlns:a="http://schemas.openxmlformats.org/drawingml/2006/main" noChangeAspect="1"/>
+            </wp:cNvGraphicFramePr>
+            <a:graphic xmlns:a="http://schemas.openxmlformats.org/drawingml/2006/main">
+              <a:graphicData uri="http://schemas.openxmlformats.org/drawingml/2006/picture">
+                <pic:pic xmlns:pic="http://schemas.openxmlformats.org/drawingml/2006/picture">
+                  <pic:nvPicPr>
+                    <pic:cNvPr id="1" name=""/>
+                    <pic:cNvPicPr/>
+                  </pic:nvPicPr>
+                  <pic:blipFill>
+                    <a:blip r:embed="rId25"/>
+                    <a:stretch>
+                      <a:fillRect/>
+                    </a:stretch>
+                  </pic:blipFill>
+                  <pic:spPr>
+                    <a:xfrm>
+                      <a:off x="0" y="0"/>
+                      <a:ext cx="5943600" cy="4013200"/>
+                    </a:xfrm>
+                    <a:prstGeom prst="rect">
+                      <a:avLst/>
+                    </a:prstGeom>
+                  </pic:spPr>
+                </pic:pic>
+              </a:graphicData>
+            </a:graphic>
+          </wp:inline>
+        </w:drawing>
+      </w:r>
+      <w:r>
+        <w:lastRenderedPageBreak/>
+        <w:drawing>
+          <wp:inline distT="0" distB="0" distL="0" distR="0" wp14:anchorId="479E8348" wp14:editId="1AD173BA">
+            <wp:extent cx="5943600" cy="4970780"/>
+            <wp:effectExtent l="0" t="0" r="0" b="1270"/>
+            <wp:docPr id="25" name="Picture 25"/>
+            <wp:cNvGraphicFramePr>
+              <a:graphicFrameLocks xmlns:a="http://schemas.openxmlformats.org/drawingml/2006/main" noChangeAspect="1"/>
+            </wp:cNvGraphicFramePr>
+            <a:graphic xmlns:a="http://schemas.openxmlformats.org/drawingml/2006/main">
+              <a:graphicData uri="http://schemas.openxmlformats.org/drawingml/2006/picture">
+                <pic:pic xmlns:pic="http://schemas.openxmlformats.org/drawingml/2006/picture">
+                  <pic:nvPicPr>
+                    <pic:cNvPr id="1" name=""/>
+                    <pic:cNvPicPr/>
+                  </pic:nvPicPr>
+                  <pic:blipFill>
+                    <a:blip r:embed="rId26"/>
+                    <a:stretch>
+                      <a:fillRect/>
+                    </a:stretch>
+                  </pic:blipFill>
+                  <pic:spPr>
+                    <a:xfrm>
+                      <a:off x="0" y="0"/>
+                      <a:ext cx="5943600" cy="4970780"/>
+                    </a:xfrm>
+                    <a:prstGeom prst="rect">
+                      <a:avLst/>
+                    </a:prstGeom>
+                  </pic:spPr>
+                </pic:pic>
+              </a:graphicData>
+            </a:graphic>
+          </wp:inline>
+        </w:drawing>
+      </w:r>
+    </w:p>
+    <w:p>
+      <w:r>
+        <w:t xml:space="preserve">flutter pub </w:t>
+      </w:r>
+      <w:proofErr w:type="gramStart"/>
+      <w:r>
+        <w:t>add</w:t>
+      </w:r>
+      <w:proofErr w:type="gramEnd"/>
+      <w:r>
+        <w:t xml:space="preserve"> </w:t>
+      </w:r>
+      <w:proofErr w:type="spellStart"/>
+      <w:r>
+        <w:t>sqflite</w:t>
+      </w:r>
+      <w:proofErr w:type="spellEnd"/>
+      <w:r>
+        <w:t xml:space="preserve"> path provider</w:t>
+      </w:r>
+    </w:p>
+    <w:p/>
+    <w:p/>
+    <w:p/>
+    <w:p/>
+    <w:p/>
+    <w:p/>
+    <w:p/>
+    <w:p/>
+    <w:p/>
+    <w:p/>
+    <w:p>
+      <w:r>
+        <w:lastRenderedPageBreak/>
+        <w:t>Bai4+5</w:t>
+      </w:r>
+    </w:p>
+    <w:p>
+      <w:pPr>
+        <w:rPr>
+          <w:noProof/>
+        </w:rPr>
+      </w:pPr>
+      <w:r>
+        <w:lastRenderedPageBreak/>
+        <w:drawing>
+          <wp:inline distT="0" distB="0" distL="0" distR="0" wp14:anchorId="5178E379" wp14:editId="25BB6815">
+            <wp:extent cx="3667637" cy="7897327"/>
+            <wp:effectExtent l="0" t="0" r="9525" b="8890"/>
+            <wp:docPr id="26" name="Picture 26"/>
+            <wp:cNvGraphicFramePr>
+              <a:graphicFrameLocks xmlns:a="http://schemas.openxmlformats.org/drawingml/2006/main" noChangeAspect="1"/>
+            </wp:cNvGraphicFramePr>
+            <a:graphic xmlns:a="http://schemas.openxmlformats.org/drawingml/2006/main">
+              <a:graphicData uri="http://schemas.openxmlformats.org/drawingml/2006/picture">
+                <pic:pic xmlns:pic="http://schemas.openxmlformats.org/drawingml/2006/picture">
+                  <pic:nvPicPr>
+                    <pic:cNvPr id="1" name=""/>
+                    <pic:cNvPicPr/>
+                  </pic:nvPicPr>
+                  <pic:blipFill>
+                    <a:blip r:embed="rId27"/>
+                    <a:stretch>
+                      <a:fillRect/>
+                    </a:stretch>
+                  </pic:blipFill>
+                  <pic:spPr>
+                    <a:xfrm>
+                      <a:off x="0" y="0"/>
+                      <a:ext cx="3667637" cy="7897327"/>
+                    </a:xfrm>
+                    <a:prstGeom prst="rect">
+                      <a:avLst/>
+                    </a:prstGeom>
+                  </pic:spPr>
+                </pic:pic>
+              </a:graphicData>
+            </a:graphic>
+          </wp:inline>
+        </w:drawing>
+      </w:r>
+      <w:r>
+        <w:rPr>
+          <w:noProof/>
+        </w:rPr>
+        <w:t xml:space="preserve"> </w:t>
+      </w:r>
+      <w:bookmarkStart w:id="0" w:name="_GoBack"/>
+      <w:bookmarkEnd w:id="0"/>
+      <w:r>
+        <w:lastRenderedPageBreak/>
+        <w:drawing>
+          <wp:inline distT="0" distB="0" distL="0" distR="0" wp14:anchorId="52D1B9A1" wp14:editId="52CB4A4D">
+            <wp:extent cx="3829584" cy="8078327"/>
+            <wp:effectExtent l="0" t="0" r="0" b="0"/>
+            <wp:docPr id="27" name="Picture 27"/>
+            <wp:cNvGraphicFramePr>
+              <a:graphicFrameLocks xmlns:a="http://schemas.openxmlformats.org/drawingml/2006/main" noChangeAspect="1"/>
+            </wp:cNvGraphicFramePr>
+            <a:graphic xmlns:a="http://schemas.openxmlformats.org/drawingml/2006/main">
+              <a:graphicData uri="http://schemas.openxmlformats.org/drawingml/2006/picture">
+                <pic:pic xmlns:pic="http://schemas.openxmlformats.org/drawingml/2006/picture">
+                  <pic:nvPicPr>
+                    <pic:cNvPr id="1" name=""/>
+                    <pic:cNvPicPr/>
+                  </pic:nvPicPr>
+                  <pic:blipFill>
+                    <a:blip r:embed="rId28"/>
+                    <a:stretch>
+                      <a:fillRect/>
+                    </a:stretch>
+                  </pic:blipFill>
+                  <pic:spPr>
+                    <a:xfrm>
+                      <a:off x="0" y="0"/>
+                      <a:ext cx="3829584" cy="8078327"/>
+                    </a:xfrm>
+                    <a:prstGeom prst="rect">
+                      <a:avLst/>
+                    </a:prstGeom>
+                  </pic:spPr>
+                </pic:pic>
+              </a:graphicData>
+            </a:graphic>
+          </wp:inline>
+        </w:drawing>
+      </w:r>
+      <w:r>
+        <w:rPr>
+          <w:noProof/>
+        </w:rPr>
+        <w:t xml:space="preserve"> </w:t>
+      </w:r>
+      <w:r>
+        <w:rPr>
+          <w:noProof/>
+        </w:rPr>
+        <w:lastRenderedPageBreak/>
+        <w:drawing>
+          <wp:inline distT="0" distB="0" distL="0" distR="0" wp14:anchorId="75FB9A7F" wp14:editId="506300B5">
+            <wp:extent cx="3648584" cy="7897327"/>
+            <wp:effectExtent l="0" t="0" r="9525" b="8890"/>
+            <wp:docPr id="28" name="Picture 28"/>
+            <wp:cNvGraphicFramePr>
+              <a:graphicFrameLocks xmlns:a="http://schemas.openxmlformats.org/drawingml/2006/main" noChangeAspect="1"/>
+            </wp:cNvGraphicFramePr>
+            <a:graphic xmlns:a="http://schemas.openxmlformats.org/drawingml/2006/main">
+              <a:graphicData uri="http://schemas.openxmlformats.org/drawingml/2006/picture">
+                <pic:pic xmlns:pic="http://schemas.openxmlformats.org/drawingml/2006/picture">
+                  <pic:nvPicPr>
+                    <pic:cNvPr id="1" name=""/>
+                    <pic:cNvPicPr/>
+                  </pic:nvPicPr>
+                  <pic:blipFill>
+                    <a:blip r:embed="rId29"/>
+                    <a:stretch>
+                      <a:fillRect/>
+                    </a:stretch>
+                  </pic:blipFill>
+                  <pic:spPr>
+                    <a:xfrm>
+                      <a:off x="0" y="0"/>
+                      <a:ext cx="3648584" cy="7897327"/>
+                    </a:xfrm>
+                    <a:prstGeom prst="rect">
+                      <a:avLst/>
+                    </a:prstGeom>
+                  </pic:spPr>
+                </pic:pic>
+              </a:graphicData>
+            </a:graphic>
+          </wp:inline>
+        </w:drawing>
+      </w:r>
+      <w:r>
+        <w:rPr>
+          <w:noProof/>
+        </w:rPr>
+        <w:t xml:space="preserve"> </w:t>
+      </w:r>
+      <w:r>
+        <w:rPr>
+          <w:noProof/>
+        </w:rPr>
+        <w:lastRenderedPageBreak/>
+        <w:drawing>
+          <wp:inline distT="0" distB="0" distL="0" distR="0" wp14:anchorId="50E21F08" wp14:editId="7A598E83">
+            <wp:extent cx="5943600" cy="7018655"/>
+            <wp:effectExtent l="0" t="0" r="0" b="0"/>
+            <wp:docPr id="30" name="Picture 30"/>
+            <wp:cNvGraphicFramePr>
+              <a:graphicFrameLocks xmlns:a="http://schemas.openxmlformats.org/drawingml/2006/main" noChangeAspect="1"/>
+            </wp:cNvGraphicFramePr>
+            <a:graphic xmlns:a="http://schemas.openxmlformats.org/drawingml/2006/main">
+              <a:graphicData uri="http://schemas.openxmlformats.org/drawingml/2006/picture">
+                <pic:pic xmlns:pic="http://schemas.openxmlformats.org/drawingml/2006/picture">
+                  <pic:nvPicPr>
+                    <pic:cNvPr id="1" name=""/>
+                    <pic:cNvPicPr/>
+                  </pic:nvPicPr>
+                  <pic:blipFill>
+                    <a:blip r:embed="rId30"/>
+                    <a:stretch>
+                      <a:fillRect/>
+                    </a:stretch>
+                  </pic:blipFill>
+                  <pic:spPr>
+                    <a:xfrm>
+                      <a:off x="0" y="0"/>
+                      <a:ext cx="5943600" cy="7018655"/>
+                    </a:xfrm>
+                    <a:prstGeom prst="rect">
+                      <a:avLst/>
+                    </a:prstGeom>
+                  </pic:spPr>
+                </pic:pic>
+              </a:graphicData>
+            </a:graphic>
+          </wp:inline>
+        </w:drawing>
+      </w:r>
+      <w:r>
+        <w:rPr>
+          <w:noProof/>
+        </w:rPr>
+        <w:t xml:space="preserve"> </w:t>
+      </w:r>
+      <w:r>
+        <w:rPr>
+          <w:noProof/>
+        </w:rPr>
+        <w:lastRenderedPageBreak/>
+        <w:drawing>
+          <wp:inline distT="0" distB="0" distL="0" distR="0" wp14:anchorId="4AE8940F" wp14:editId="50A83046">
+            <wp:extent cx="5943600" cy="5758180"/>
+            <wp:effectExtent l="0" t="0" r="0" b="0"/>
+            <wp:docPr id="31" name="Picture 31"/>
+            <wp:cNvGraphicFramePr>
+              <a:graphicFrameLocks xmlns:a="http://schemas.openxmlformats.org/drawingml/2006/main" noChangeAspect="1"/>
+            </wp:cNvGraphicFramePr>
+            <a:graphic xmlns:a="http://schemas.openxmlformats.org/drawingml/2006/main">
+              <a:graphicData uri="http://schemas.openxmlformats.org/drawingml/2006/picture">
+                <pic:pic xmlns:pic="http://schemas.openxmlformats.org/drawingml/2006/picture">
+                  <pic:nvPicPr>
+                    <pic:cNvPr id="1" name=""/>
+                    <pic:cNvPicPr/>
+                  </pic:nvPicPr>
+                  <pic:blipFill>
+                    <a:blip r:embed="rId31"/>
+                    <a:stretch>
+                      <a:fillRect/>
+                    </a:stretch>
+                  </pic:blipFill>
+                  <pic:spPr>
+                    <a:xfrm>
+                      <a:off x="0" y="0"/>
+                      <a:ext cx="5943600" cy="5758180"/>
+                    </a:xfrm>
+                    <a:prstGeom prst="rect">
+                      <a:avLst/>
+                    </a:prstGeom>
+                  </pic:spPr>
+                </pic:pic>
+              </a:graphicData>
+            </a:graphic>
+          </wp:inline>
+        </w:drawing>
+      </w:r>
+      <w:r>
+        <w:rPr>
+          <w:noProof/>
+        </w:rPr>
+        <w:t xml:space="preserve"> </w:t>
+      </w:r>
+      <w:r>
+        <w:rPr>
+          <w:noProof/>
+        </w:rPr>
+        <w:lastRenderedPageBreak/>
+        <w:drawing>
+          <wp:inline distT="0" distB="0" distL="0" distR="0" wp14:anchorId="5EAE41EA" wp14:editId="5E2392B6">
+            <wp:extent cx="3943900" cy="2934109"/>
+            <wp:effectExtent l="0" t="0" r="0" b="0"/>
+            <wp:docPr id="32" name="Picture 32"/>
+            <wp:cNvGraphicFramePr>
+              <a:graphicFrameLocks xmlns:a="http://schemas.openxmlformats.org/drawingml/2006/main" noChangeAspect="1"/>
+            </wp:cNvGraphicFramePr>
+            <a:graphic xmlns:a="http://schemas.openxmlformats.org/drawingml/2006/main">
+              <a:graphicData uri="http://schemas.openxmlformats.org/drawingml/2006/picture">
+                <pic:pic xmlns:pic="http://schemas.openxmlformats.org/drawingml/2006/picture">
+                  <pic:nvPicPr>
+                    <pic:cNvPr id="1" name=""/>
+                    <pic:cNvPicPr/>
+                  </pic:nvPicPr>
+                  <pic:blipFill>
+                    <a:blip r:embed="rId32"/>
+                    <a:stretch>
+                      <a:fillRect/>
+                    </a:stretch>
+                  </pic:blipFill>
+                  <pic:spPr>
+                    <a:xfrm>
+                      <a:off x="0" y="0"/>
+                      <a:ext cx="3943900" cy="2934109"/>
+                    </a:xfrm>
+                    <a:prstGeom prst="rect">
+                      <a:avLst/>
+                    </a:prstGeom>
+                  </pic:spPr>
+                </pic:pic>
+              </a:graphicData>
+            </a:graphic>
+          </wp:inline>
+        </w:drawing>
+      </w:r>
+      <w:r>
+        <w:rPr>
+          <w:noProof/>
+        </w:rPr>
+        <w:t xml:space="preserve"> </w:t>
+      </w:r>
+      <w:r>
+        <w:rPr>
+          <w:noProof/>
+        </w:rPr>
+        <w:drawing>
+          <wp:inline distT="0" distB="0" distL="0" distR="0" wp14:anchorId="0CE29FED" wp14:editId="7425ECC3">
+            <wp:extent cx="4334494" cy="4359501"/>
+            <wp:effectExtent l="0" t="0" r="9525" b="3175"/>
+            <wp:docPr id="33" name="Picture 33"/>
+            <wp:cNvGraphicFramePr>
+              <a:graphicFrameLocks xmlns:a="http://schemas.openxmlformats.org/drawingml/2006/main" noChangeAspect="1"/>
+            </wp:cNvGraphicFramePr>
+            <a:graphic xmlns:a="http://schemas.openxmlformats.org/drawingml/2006/main">
+              <a:graphicData uri="http://schemas.openxmlformats.org/drawingml/2006/picture">
+                <pic:pic xmlns:pic="http://schemas.openxmlformats.org/drawingml/2006/picture">
+                  <pic:nvPicPr>
+                    <pic:cNvPr id="1" name=""/>
+                    <pic:cNvPicPr/>
+                  </pic:nvPicPr>
+                  <pic:blipFill>
+                    <a:blip r:embed="rId33"/>
+                    <a:stretch>
+                      <a:fillRect/>
+                    </a:stretch>
+                  </pic:blipFill>
+                  <pic:spPr>
+                    <a:xfrm>
+                      <a:off x="0" y="0"/>
+                      <a:ext cx="4341305" cy="4366351"/>
+                    </a:xfrm>
+                    <a:prstGeom prst="rect">
+                      <a:avLst/>
+                    </a:prstGeom>
+                  </pic:spPr>
+                </pic:pic>
+              </a:graphicData>
+            </a:graphic>
+          </wp:inline>
+        </w:drawing>
+      </w:r>
+    </w:p>
+    <w:p>
+      <w:pPr>
+        <w:rPr>
+          <w:noProof/>
+        </w:rPr>
+      </w:pPr>
+      <w:r>
+        <w:lastRenderedPageBreak/>
+        <w:drawing>
+          <wp:inline distT="0" distB="0" distL="0" distR="0" wp14:anchorId="7B21E8D8" wp14:editId="385D29BA">
+            <wp:extent cx="5943600" cy="4820285"/>
+            <wp:effectExtent l="0" t="0" r="0" b="0"/>
+            <wp:docPr id="34" name="Picture 34"/>
+            <wp:cNvGraphicFramePr>
+              <a:graphicFrameLocks xmlns:a="http://schemas.openxmlformats.org/drawingml/2006/main" noChangeAspect="1"/>
+            </wp:cNvGraphicFramePr>
+            <a:graphic xmlns:a="http://schemas.openxmlformats.org/drawingml/2006/main">
+              <a:graphicData uri="http://schemas.openxmlformats.org/drawingml/2006/picture">
+                <pic:pic xmlns:pic="http://schemas.openxmlformats.org/drawingml/2006/picture">
+                  <pic:nvPicPr>
+                    <pic:cNvPr id="1" name=""/>
+                    <pic:cNvPicPr/>
+                  </pic:nvPicPr>
+                  <pic:blipFill>
+                    <a:blip r:embed="rId34"/>
+                    <a:stretch>
+                      <a:fillRect/>
+                    </a:stretch>
+                  </pic:blipFill>
+                  <pic:spPr>
+                    <a:xfrm>
+                      <a:off x="0" y="0"/>
+                      <a:ext cx="5943600" cy="4820285"/>
+                    </a:xfrm>
+                    <a:prstGeom prst="rect">
+                      <a:avLst/>
+                    </a:prstGeom>
+                  </pic:spPr>
+                </pic:pic>
+              </a:graphicData>
+            </a:graphic>
+          </wp:inline>
+        </w:drawing>
+      </w:r>
+      <w:r>
+        <w:rPr>
+          <w:noProof/>
+        </w:rPr>
+        <w:t xml:space="preserve"> </w:t>
+      </w:r>
+      <w:r>
+        <w:lastRenderedPageBreak/>
+        <w:drawing>
+          <wp:inline distT="0" distB="0" distL="0" distR="0" wp14:anchorId="317C6146" wp14:editId="291066A3">
+            <wp:extent cx="5943600" cy="4664075"/>
+            <wp:effectExtent l="0" t="0" r="0" b="3175"/>
+            <wp:docPr id="35" name="Picture 35"/>
+            <wp:cNvGraphicFramePr>
+              <a:graphicFrameLocks xmlns:a="http://schemas.openxmlformats.org/drawingml/2006/main" noChangeAspect="1"/>
+            </wp:cNvGraphicFramePr>
+            <a:graphic xmlns:a="http://schemas.openxmlformats.org/drawingml/2006/main">
+              <a:graphicData uri="http://schemas.openxmlformats.org/drawingml/2006/picture">
+                <pic:pic xmlns:pic="http://schemas.openxmlformats.org/drawingml/2006/picture">
+                  <pic:nvPicPr>
+                    <pic:cNvPr id="1" name=""/>
+                    <pic:cNvPicPr/>
+                  </pic:nvPicPr>
+                  <pic:blipFill>
+                    <a:blip r:embed="rId35"/>
+                    <a:stretch>
+                      <a:fillRect/>
+                    </a:stretch>
+                  </pic:blipFill>
+                  <pic:spPr>
+                    <a:xfrm>
+                      <a:off x="0" y="0"/>
+                      <a:ext cx="5943600" cy="4664075"/>
+                    </a:xfrm>
+                    <a:prstGeom prst="rect">
+                      <a:avLst/>
+                    </a:prstGeom>
+                  </pic:spPr>
+                </pic:pic>
+              </a:graphicData>
+            </a:graphic>
+          </wp:inline>
+        </w:drawing>
+      </w:r>
+      <w:r>
+        <w:rPr>
+          <w:noProof/>
+        </w:rPr>
+        <w:t xml:space="preserve"> </w:t>
+      </w:r>
+      <w:r>
+        <w:rPr>
+          <w:noProof/>
+        </w:rPr>
+        <w:lastRenderedPageBreak/>
+        <w:drawing>
+          <wp:inline distT="0" distB="0" distL="0" distR="0" wp14:anchorId="1CA98399" wp14:editId="7BB41078">
+            <wp:extent cx="5943600" cy="3842385"/>
+            <wp:effectExtent l="0" t="0" r="0" b="5715"/>
+            <wp:docPr id="36" name="Picture 36"/>
+            <wp:cNvGraphicFramePr>
+              <a:graphicFrameLocks xmlns:a="http://schemas.openxmlformats.org/drawingml/2006/main" noChangeAspect="1"/>
+            </wp:cNvGraphicFramePr>
+            <a:graphic xmlns:a="http://schemas.openxmlformats.org/drawingml/2006/main">
+              <a:graphicData uri="http://schemas.openxmlformats.org/drawingml/2006/picture">
+                <pic:pic xmlns:pic="http://schemas.openxmlformats.org/drawingml/2006/picture">
+                  <pic:nvPicPr>
+                    <pic:cNvPr id="1" name=""/>
+                    <pic:cNvPicPr/>
+                  </pic:nvPicPr>
+                  <pic:blipFill>
+                    <a:blip r:embed="rId36"/>
+                    <a:stretch>
+                      <a:fillRect/>
+                    </a:stretch>
+                  </pic:blipFill>
+                  <pic:spPr>
+                    <a:xfrm>
+                      <a:off x="0" y="0"/>
+                      <a:ext cx="5943600" cy="3842385"/>
+                    </a:xfrm>
+                    <a:prstGeom prst="rect">
+                      <a:avLst/>
+                    </a:prstGeom>
+                  </pic:spPr>
+                </pic:pic>
+              </a:graphicData>
+            </a:graphic>
+          </wp:inline>
+        </w:drawing>
+      </w:r>
+    </w:p>
+    <w:p>
+      <w:r>
+        <w:lastRenderedPageBreak/>
+        <w:drawing>
+          <wp:inline distT="0" distB="0" distL="0" distR="0" wp14:anchorId="79C95705" wp14:editId="498A3425">
+            <wp:extent cx="5943600" cy="3728085"/>
+            <wp:effectExtent l="0" t="0" r="0" b="5715"/>
+            <wp:docPr id="37" name="Picture 37"/>
+            <wp:cNvGraphicFramePr>
+              <a:graphicFrameLocks xmlns:a="http://schemas.openxmlformats.org/drawingml/2006/main" noChangeAspect="1"/>
+            </wp:cNvGraphicFramePr>
+            <a:graphic xmlns:a="http://schemas.openxmlformats.org/drawingml/2006/main">
+              <a:graphicData uri="http://schemas.openxmlformats.org/drawingml/2006/picture">
+                <pic:pic xmlns:pic="http://schemas.openxmlformats.org/drawingml/2006/picture">
+                  <pic:nvPicPr>
+                    <pic:cNvPr id="1" name=""/>
+                    <pic:cNvPicPr/>
+                  </pic:nvPicPr>
+                  <pic:blipFill>
+                    <a:blip r:embed="rId37"/>
+                    <a:stretch>
+                      <a:fillRect/>
+                    </a:stretch>
+                  </pic:blipFill>
+                  <pic:spPr>
+                    <a:xfrm>
+                      <a:off x="0" y="0"/>
+                      <a:ext cx="5943600" cy="3728085"/>
+                    </a:xfrm>
+                    <a:prstGeom prst="rect">
+                      <a:avLst/>
+                    </a:prstGeom>
+                  </pic:spPr>
+                </pic:pic>
+              </a:graphicData>
+            </a:graphic>
+          </wp:inline>
+        </w:drawing>
+      </w:r>
+      <w:r>
+        <w:rPr>
+          <w:noProof/>
+        </w:rPr>
+        <w:t xml:space="preserve"> </w:t>
+      </w:r>
+      <w:r>
+        <w:lastRenderedPageBreak/>
+        <w:drawing>
+          <wp:inline distT="0" distB="0" distL="0" distR="0" wp14:anchorId="12C62962" wp14:editId="473B7C4F">
+            <wp:extent cx="5943600" cy="4716780"/>
+            <wp:effectExtent l="0" t="0" r="0" b="7620"/>
+            <wp:docPr id="38" name="Picture 38"/>
+            <wp:cNvGraphicFramePr>
+              <a:graphicFrameLocks xmlns:a="http://schemas.openxmlformats.org/drawingml/2006/main" noChangeAspect="1"/>
+            </wp:cNvGraphicFramePr>
+            <a:graphic xmlns:a="http://schemas.openxmlformats.org/drawingml/2006/main">
+              <a:graphicData uri="http://schemas.openxmlformats.org/drawingml/2006/picture">
+                <pic:pic xmlns:pic="http://schemas.openxmlformats.org/drawingml/2006/picture">
+                  <pic:nvPicPr>
+                    <pic:cNvPr id="1" name=""/>
+                    <pic:cNvPicPr/>
+                  </pic:nvPicPr>
+                  <pic:blipFill>
+                    <a:blip r:embed="rId38"/>
+                    <a:stretch>
+                      <a:fillRect/>
+                    </a:stretch>
+                  </pic:blipFill>
+                  <pic:spPr>
+                    <a:xfrm>
+                      <a:off x="0" y="0"/>
+                      <a:ext cx="5943600" cy="4716780"/>
                     </a:xfrm>
                     <a:prstGeom prst="rect">
                       <a:avLst/>
@@ -621,7 +1587,7 @@
 </file>
 
 <file path=word/styles.xml><?xml version="1.0" encoding="utf-8"?>
-<w:styles xmlns:mc="http://schemas.openxmlformats.org/markup-compatibility/2006" xmlns:r="http://schemas.openxmlformats.org/officeDocument/2006/relationships" xmlns:w="http://schemas.openxmlformats.org/wordprocessingml/2006/main" xmlns:w14="http://schemas.microsoft.com/office/word/2010/wordml" xmlns:w15="http://schemas.microsoft.com/office/word/2012/wordml" xmlns:w16cex="http://schemas.microsoft.com/office/word/2018/wordml/cex" xmlns:w16cid="http://schemas.microsoft.com/office/word/2016/wordml/cid" xmlns:w16="http://schemas.microsoft.com/office/word/2018/wordml" xmlns:w16sdtdh="http://schemas.microsoft.com/office/word/2020/wordml/sdtdatahash" xmlns:w16se="http://schemas.microsoft.com/office/word/2015/wordml/symex" mc:Ignorable="w14 w15 w16se w16cid w16 w16cex w16sdtdh">
+<w:styles xmlns:mc="http://schemas.openxmlformats.org/markup-compatibility/2006" xmlns:r="http://schemas.openxmlformats.org/officeDocument/2006/relationships" xmlns:w="http://schemas.openxmlformats.org/wordprocessingml/2006/main" xmlns:w14="http://schemas.microsoft.com/office/word/2010/wordml" xmlns:w15="http://schemas.microsoft.com/office/word/2012/wordml" xmlns:w16cid="http://schemas.microsoft.com/office/word/2016/wordml/cid" xmlns:w16se="http://schemas.microsoft.com/office/word/2015/wordml/symex" mc:Ignorable="w14 w15 w16se w16cid">
   <w:docDefaults>
     <w:rPrDefault>
       <w:rPr>
@@ -637,7 +1603,7 @@
       </w:pPr>
     </w:pPrDefault>
   </w:docDefaults>
-  <w:latentStyles w:defLockedState="0" w:defUIPriority="99" w:defSemiHidden="0" w:defUnhideWhenUsed="0" w:defQFormat="0" w:count="376">
+  <w:latentStyles w:defLockedState="0" w:defUIPriority="99" w:defSemiHidden="0" w:defUnhideWhenUsed="0" w:defQFormat="0" w:count="375">
     <w:lsdException w:name="Normal" w:uiPriority="0" w:qFormat="1"/>
     <w:lsdException w:name="heading 1" w:uiPriority="9" w:qFormat="1"/>
     <w:lsdException w:name="heading 2" w:semiHidden="1" w:uiPriority="9" w:unhideWhenUsed="1" w:qFormat="1"/>
@@ -1013,7 +1979,6 @@
     <w:lsdException w:name="Smart Hyperlink" w:semiHidden="1" w:unhideWhenUsed="1"/>
     <w:lsdException w:name="Hashtag" w:semiHidden="1" w:unhideWhenUsed="1"/>
     <w:lsdException w:name="Unresolved Mention" w:semiHidden="1" w:unhideWhenUsed="1"/>
-    <w:lsdException w:name="Smart Link" w:semiHidden="1" w:unhideWhenUsed="1"/>
   </w:latentStyles>
   <w:style w:type="paragraph" w:default="1" w:styleId="Normal">
     <w:name w:val="Normal"/>

</xml_diff>